<commit_message>
w5k (5.2.0-rc.6-wizard.5.11): mean welfare prices and % changes, benchmarking fix, docs
</commit_message>
<xml_diff>
--- a/docs/guidance/guidelines_v5_2_0_rc6_wizard.docx
+++ b/docs/guidance/guidelines_v5_2_0_rc6_wizard.docx
@@ -15,7 +15,7 @@
           <wp:inline distT="0" distB="0" distL="0" distR="0" wp14:anchorId="0F806ED2" wp14:editId="4D282BE1">
             <wp:extent cx="5943600" cy="8172450"/>
             <wp:effectExtent l="0" t="0" r="0" b="0"/>
-            <wp:docPr id="17" name="Picture 17" descr="Full-page app-style cover image with an example map of poverty rates by Spanish province, produced by the package (boundaries: IGN CartoBase ANE, CC BY 4.0)." title="App-style cover with example Spain poverty map"/>
+            <wp:docPr id="17" name="Picture 17" descr="Full-page cover image showing the front page of the EU SAE app." title="Cover with the EU SAE app front page"/>
             <wp:cNvGraphicFramePr>
               <a:graphicFrameLocks xmlns:a="http://schemas.openxmlformats.org/drawingml/2006/main" noChangeAspect="1"/>
             </wp:cNvGraphicFramePr>
@@ -23,7 +23,7 @@
               <a:graphicData uri="http://schemas.openxmlformats.org/drawingml/2006/picture">
                 <pic:pic xmlns:pic="http://schemas.openxmlformats.org/drawingml/2006/picture">
                   <pic:nvPicPr>
-                    <pic:cNvPr id="0" name="eu-poverty-map-cover-app-style-with-text.png"/>
+                    <pic:cNvPr id="0" name="eu-sae-cover-app-front-page.png"/>
                     <pic:cNvPicPr/>
                   </pic:nvPicPr>
                   <pic:blipFill>
@@ -190,7 +190,7 @@
                       <w:sz w:val="21"/>
                       <w:szCs w:val="21"/>
                     </w:rPr>
-                    <w:t>Candidate 5.2.0-rc.6 — September 2026</w:t>
+                    <w:t>Candidate 5.2.0-rc.6 — October 2026</w:t>
                   </w:r>
                 </w:p>
               </w:txbxContent>
@@ -6669,6 +6669,28 @@
       <w:pPr>
         <w:pStyle w:val="BodyText"/>
       </w:pPr>
+      <w:r>
+        <w:rPr>
+          <w:b/>
+        </w:rPr>
+        <w:t xml:space="preserve">w5k update (October 2026). </w:t>
+      </w:r>
+      <w:r>
+        <w:t xml:space="preserve">For mean welfare, the Indicator step now asks which prices the survey welfare is in: current prices converted to constant prices with a consumer price index (typed in or read from an optional CPI file), current prices without conversion, or constant prices already. When a price index is used, the user states whether incomes refer to the survey year or to the calendar year before the survey, how the index is organised, and the price base year (Sections 4.3 and 11.5). Changes in mean welfare are reported as percentage changes of the mean, with intervals from the log of the ratio of the two means (Section 8.12 and Annex G.7).</w:t>
+      </w:r>
+    </w:p>
+    <w:p>
+      <w:pPr>
+        <w:pStyle w:val="BodyText"/>
+      </w:pPr>
+      <w:r>
+        <w:t xml:space="preserve">The covariance-adjusted variance of a change is now used whenever it is positive; the earlier rule that replaced it by the independence variance when it was below 1% of that variance has been removed (Section 8.12). When mean welfare is fitted in logs, benchmarking to an uploaded Benchmark Target Database is completed on the currency scale, so the benchmarked estimates reproduce the uploaded targets (Sections 7.12 and G.6). The report's box plots now show the estimated changes and their RMSEs for Direct, UFH, UFH benchmarked, MFH, and MFH benchmarked (Section 11.9).</w:t>
+      </w:r>
+    </w:p>
+    <w:p>
+      <w:pPr>
+        <w:pStyle w:val="BodyText"/>
+      </w:pPr>
     </w:p>
     <w:p>
       <w:pPr>
@@ -9699,6 +9721,14 @@
     </w:p>
     <w:p>
       <w:pPr>
+        <w:pStyle w:val="BodyText"/>
+      </w:pPr>
+      <w:r>
+        <w:t xml:space="preserve">For mean welfare, benchmark targets must be in the same prices as the survey welfare. When the Dashboard converts welfare to constant prices with a price index, it converts the uploaded targets with the same factors, so targets should then be supplied in the current prices of each year; when the survey welfare is already in constant prices, the targets must be in those same prices. A target describes the whole benchmark area: if some of its domains have no estimate in a year, the run log lists them, because the remaining domains are then scaled to the whole-area target.</w:t>
+      </w:r>
+    </w:p>
+    <w:p>
+      <w:pPr>
         <w:pStyle w:val="Heading2"/>
       </w:pPr>
       <w:bookmarkStart w:id="74" w:name="minimum-data-readiness-checklist"/>
@@ -9986,6 +10016,28 @@
       </w:pPr>
       <w:r>
         <w:t>For poverty indicators, the welfare variable is used to determine whether each household or individual is poor. For mean welfare indicators, the welfare variable itself is modeled after any required transformation. Users should therefore confirm whether the analysis is estimating poverty rates, mean welfare, or both.</w:t>
+      </w:r>
+    </w:p>
+    <w:p>
+      <w:pPr>
+        <w:pStyle w:val="BodyText"/>
+      </w:pPr>
+      <w:r>
+        <w:rPr>
+          <w:b/>
+        </w:rPr>
+        <w:t xml:space="preserve">Prices of welfare. </w:t>
+      </w:r>
+      <w:r>
+        <w:t xml:space="preserve">Household-survey incomes and expenditures are usually reported in current (nominal) prices, so a change in mean welfare between years includes inflation. For mean welfare, the Dashboard offers three choices (Section 11.5): convert current prices to constant prices of a base year with a consumer price index; keep current prices, in which case changes include inflation; or declare that the welfare variable is already in constant (real) prices, in which case no price index is needed or applied. When converting, the welfare of survey year t is multiplied by P(base year) / P(income year of t), where P is the price level. The income year is the survey year for surveys of current income or consumption, and the calendar year before the survey for surveys such as EU-SILC, whose income reference period is the previous calendar year. Annual-average indices should be used for annual incomes. The conversion is applied to household welfare before estimation, so all models work with welfare in constant prices.</w:t>
+      </w:r>
+    </w:p>
+    <w:p>
+      <w:pPr>
+        <w:pStyle w:val="BodyText"/>
+      </w:pPr>
+      <w:r>
+        <w:t xml:space="preserve">The two income-period choices cover calendar years only. For a fiscal year, a rolling 12-month period before the interview, or reference periods that differ between households, welfare should be deflated before it is loaded (for example, household by household with the average index of its own reference period), and the constant-prices-already choice should then be selected. Welfare already in real terms must be in the prices of the same year in every survey year, and on the same basis if spatial price adjustments were made; the Dashboard cannot check this. Poverty indicators are never converted: the welfare variable and the poverty line must already be in the same prices in each year.</w:t>
       </w:r>
     </w:p>
     <w:p>
@@ -16774,6 +16826,20 @@
         <w:pStyle w:val="BodyText"/>
       </w:pPr>
       <w:r>
+        <w:rPr>
+          <w:b/>
+        </w:rPr>
+        <w:t xml:space="preserve">Mean welfare fitted in logs. </w:t>
+      </w:r>
+      <w:r>
+        <w:t xml:space="preserve">For mean welfare modeled on the log scale, benchmarking is completed on the currency scale. The log-scale bootstrap described above benchmarks to the survey's own regional figures, expressed in logs, and supplies the relative precision of the benchmarked estimates. After the back-transformation, each domain estimate is multiplied by its group's target divided by the population-weighted average of the back-transformed estimates of all domains in the group, so the benchmarked estimates reproduce the target exactly. The target is the uploaded Benchmark Target Database value when one is provided and otherwise the population-weighted mean of the survey's direct arithmetic means. The reported MSE keeps the coefficient of variation of the log-scale bootstrap. This is an approximation: it treats uploaded targets as fixed and does not re-estimate the uncertainty of the final currency-scale estimator, so benchmarked RMSEs and intervals in log runs with uploaded targets should be described as approximate.</w:t>
+      </w:r>
+    </w:p>
+    <w:p>
+      <w:pPr>
+        <w:pStyle w:val="BodyText"/>
+      </w:pPr>
+      <w:r>
         <w:lastRenderedPageBreak/>
         <w:t>Benchmarking is most appropriate when the benchmark estimate is reliable; the benchmark uses the same welfare variable and poverty line; the benchmark refers to the same population universe; the benchmark geography is consistent with the small-area geography; or the benchmark year matches the survey year.</w:t>
       </w:r>
@@ -21232,15 +21298,29 @@
       </w:pPr>
       <w:r>
         <w:lastRenderedPageBreak/>
-        <w:t>Two ingredients, therefore, determine whether an estimated change is meaningful: the MSE of the estimate in each year, and the mean crossed-product error (MCPE) - the covariance of the prediction errors of the two years' estimates for the same area. The variance of the estimated change equals the MSE in the first year plus the MSE in the second year minus twice the MCPE between them. Because the two years' prediction errors are often positively correlated, omitting MCPE can overstate the uncertainty of change; its sign and magnitude must nevertheless be estimated rather than assumed. The Dashboard estimates MFH MSE and MCPE jointly by parametric bootstrap, then applies the same covariance-adjusted change formula to benchmarked or unbenchmarked results. If bootstrap noise yields a non-finite or implausibly small change MSE, the affected row is flagged and the more conservative independence value, MSE(year 1) + MSE(year 2), is used. Note on MSE Estimation - Levels and Changes.docx documents the level, benchmarking, MCPE, and change calculations, while Note on Estimating the Sampling-Error Covariance Matrix (revised).docx documents the distinct survey-design covariance supplied to the MFH model. The basic MCPE code was provided by Prof. Isabel Molina, refined by Ifeanyi Nzegwu Edochie, and modified further by the package maintainer; Annex H discloses the process and validation status, and Annex G.7 collects the formulas.</w:t>
-      </w:r>
-    </w:p>
-    <w:p>
-      <w:pPr>
-        <w:pStyle w:val="BodyText"/>
-      </w:pPr>
-      <w:r>
-        <w:t>Operationally, users should report estimated poverty in the first year; estimated poverty in the second year; estimated change in percentage points; standard error and pointwise 95% confidence interval for the change; the raw p_value; and the principal significant flag based on p_value &lt; alpha. The Dashboard's red/gray change figures use this pointwise two-sided test. At alpha = 0.05, a change is marked significant exactly when its pointwise 95% confidence interval excludes zero. The Benjamini-Hochberg-adjusted p_value_bh and significant_bh fields are retained as supplementary multiplicity-sensitive outputs, but they do not control the primary figures or headline counts.</w:t>
+        <w:t xml:space="preserve">Two ingredients, therefore, determine whether an estimated change is meaningful: the MSE of the estimate in each year, and the mean crossed-product error (MCPE) - the covariance of the prediction errors of the two years' estimates for the same area. The variance of the estimated change equals the MSE in the first year plus the MSE in the second year minus twice the MCPE between them. Because the two years' prediction errors are often positively correlated, omitting MCPE can overstate the uncertainty of change; its sign and magnitude must nevertheless be estimated rather than assumed. The Dashboard estimates MFH MSE and MCPE jointly by parametric bootstrap, then applies the same covariance-adjusted change formula to benchmarked or unbenchmarked results. The covariance-adjusted change MSE is used whenever it is positive, however small. Only when bootstrap noise yields a zero, negative, or non-finite value is the independence value, MSE(year 1) + MSE(year 2), used instead; such rows are marked in the mse_fallback_used and mse_rule columns. The independence value is not guaranteed to be conservative, so flagged rows should be reviewed, for example with more bootstrap replications. Note on MSE Estimation - Levels and Changes.docx documents the level, benchmarking, MCPE, and change calculations, while Note on Estimating the Sampling-Error Covariance Matrix (revised).docx documents the distinct survey-design covariance supplied to the MFH model. The basic MCPE code was provided by Prof. Isabel Molina, refined by Ifeanyi Nzegwu Edochie, and modified further by the package maintainer; Annex H discloses the process and validation status, and Annex G.7 collects the formulas.</w:t>
+      </w:r>
+    </w:p>
+    <w:p>
+      <w:pPr>
+        <w:pStyle w:val="BodyText"/>
+      </w:pPr>
+      <w:r>
+        <w:t xml:space="preserve">Operationally, users should report estimated poverty in the first year; estimated poverty in the second year; estimated change in percentage points (for mean welfare, in percent of the earlier year's mean); standard error and pointwise 95% confidence interval for the change; the raw p_value; and the principal significant flag based on p_value &lt; alpha. The Dashboard's red/gray change figures use this pointwise two-sided test. At alpha = 0.05, a change is marked significant exactly when its pointwise 95% confidence interval excludes zero. The Benjamini-Hochberg-adjusted p_value_bh and significant_bh fields are retained as supplementary multiplicity-sensitive outputs, but they do not control the primary figures or headline counts.</w:t>
+      </w:r>
+    </w:p>
+    <w:p>
+      <w:pPr>
+        <w:pStyle w:val="BodyText"/>
+      </w:pPr>
+      <w:r>
+        <w:rPr>
+          <w:b/>
+        </w:rPr>
+        <w:t xml:space="preserve">Changes in mean welfare. </w:t>
+      </w:r>
+      <w:r>
+        <w:t xml:space="preserve">For mean welfare, the Dashboard reports the change as a percentage of the earlier year's mean, 100 × (mean in the later year / mean in the earlier year − 1). Its confidence interval and p-value come from the log of the ratio of the two means, whose variance is approximated by the delta method from the two MSEs and the covariance implied by the change MSE (Annex G.7); the interval is asymmetric and never below −100%. The difference in currency units is kept in output columns ending in _eur. The difference of mean log welfare is not used, because it measures the change in the geometric mean, which differs from the change in the arithmetic mean by the change in the mean log deviation; on the Spain example the two differ by up to 12 percentage points. Change maps and significance plots for mean welfare are labelled accordingly, for example Change in mean welfare (%).</w:t>
       </w:r>
     </w:p>
     <w:tbl>
@@ -22863,6 +22943,17 @@
       </w:pPr>
       <w:r>
         <w:t>Maps of estimated changes over time.</w:t>
+      </w:r>
+    </w:p>
+    <w:p>
+      <w:pPr>
+        <w:numPr>
+          <w:ilvl w:val="0"/>
+          <w:numId w:val="2"/>
+        </w:numPr>
+      </w:pPr>
+      <w:r>
+        <w:t xml:space="preserve">Box plots of the estimated changes and of their RMSEs across domains, by method (Direct, UFH, UFH benchmarked, MFH, MFH benchmarked).</w:t>
       </w:r>
     </w:p>
     <w:p>
@@ -23545,6 +23636,14 @@
     </w:p>
     <w:p>
       <w:pPr>
+        <w:pStyle w:val="BodyText"/>
+      </w:pPr>
+      <w:r>
+        <w:t xml:space="preserve">For mean welfare, the change maps show the percentage change of the mean (Section 8.12), and map titles and legends name the indicator rather than poverty.</w:t>
+      </w:r>
+    </w:p>
+    <w:p>
+      <w:pPr>
         <w:pStyle w:val="CaptionedFigure"/>
         <w:jc w:val="center"/>
       </w:pPr>
@@ -23710,7 +23809,7 @@
         <w:jc w:val="left"/>
       </w:pPr>
       <w:r>
-        <w:t>EU_SAE_520_w5j/</w:t>
+        <w:t>EU_SAE_520_w5k/</w:t>
         <w:br/>
         <w:t>|-- app_wizard.R          # six-step guided interface</w:t>
         <w:br/>
@@ -23866,6 +23965,14 @@
     </w:p>
     <w:p>
       <w:pPr>
+        <w:pStyle w:val="BodyText"/>
+      </w:pPr>
+      <w:r>
+        <w:t xml:space="preserve">For mean welfare in constant prices, an optional Consumer price index file can also be selected: one country's CPI (or HICP) by year, with a year column and one or more index columns, as a CSV file (comma- or semicolon-separated; decimal commas are accepted) or an Excel file. The year and CPI columns are chosen in Step 3, where the app shows the values it will use or the years that are missing.</w:t>
+      </w:r>
+    </w:p>
+    <w:p>
+      <w:pPr>
         <w:pStyle w:val="CaptionedFigure"/>
         <w:jc w:val="center"/>
       </w:pPr>
@@ -24027,6 +24134,67 @@
     </w:p>
     <w:p>
       <w:pPr>
+        <w:pStyle w:val="BodyText"/>
+      </w:pPr>
+      <w:r>
+        <w:t xml:space="preserve">For mean welfare, </w:t>
+      </w:r>
+      <w:r>
+        <w:rPr>
+          <w:b/>
+        </w:rPr>
+        <w:t xml:space="preserve">Welfare in the survey data is in</w:t>
+      </w:r>
+      <w:r>
+        <w:t xml:space="preserve"> records the prices of the welfare variable (Section 4.3): current prices: convert with a price index; current prices: no conversion (changes include inflation), which is the default; or constant (real) prices already: no price index needed, with an optional year of those prices that is used only in labels, such as constant 2017 prices as provided in the survey data.</w:t>
+      </w:r>
+    </w:p>
+    <w:p>
+      <w:pPr>
+        <w:pStyle w:val="BodyText"/>
+      </w:pPr>
+      <w:r>
+        <w:t xml:space="preserve">When converting, </w:t>
+      </w:r>
+      <w:r>
+        <w:rPr>
+          <w:b/>
+        </w:rPr>
+        <w:t xml:space="preserve">Price index values</w:t>
+      </w:r>
+      <w:r>
+        <w:t xml:space="preserve"> says whether the index is typed in by year or read from the CPI file selected in Step 1. </w:t>
+      </w:r>
+      <w:r>
+        <w:rPr>
+          <w:b/>
+        </w:rPr>
+        <w:t xml:space="preserve">Incomes refer to</w:t>
+      </w:r>
+      <w:r>
+        <w:t xml:space="preserve"> states whether the incomes of each survey are in the prices of the survey year or of the calendar year before the survey; with the second choice the app asks for, and looks up, the index of the year before each survey year. </w:t>
+      </w:r>
+      <w:r>
+        <w:rPr>
+          <w:b/>
+        </w:rPr>
+        <w:t xml:space="preserve">How the CPI is organised</w:t>
+      </w:r>
+      <w:r>
+        <w:t xml:space="preserve"> accepts an index with a fixed reference year (for example 2015 = 100), annual indices with the previous year = 100 (for example 103.6), or annual changes in percent (for example 3.6); annual values are chained into price levels. </w:t>
+      </w:r>
+      <w:r>
+        <w:rPr>
+          <w:b/>
+        </w:rPr>
+        <w:t xml:space="preserve">Price base year</w:t>
+      </w:r>
+      <w:r>
+        <w:t xml:space="preserve"> is the first income year by default; Another year allows, for example, 2017 prices, and a fixed-reference index then needs the base year's own value from the same series. Percentage changes between years do not depend on the base year; only the levels change.</w:t>
+      </w:r>
+    </w:p>
+    <w:p>
+      <w:pPr>
         <w:pStyle w:val="CaptionedFigure"/>
         <w:jc w:val="center"/>
       </w:pPr>
@@ -24082,6 +24250,60 @@
     </w:p>
     <w:p>
       <w:pPr>
+        <w:pStyle w:val="CaptionedFigure"/>
+        <w:jc w:val="center"/>
+      </w:pPr>
+      <w:r>
+        <w:rPr>
+          <w:noProof/>
+        </w:rPr>
+        <w:drawing>
+          <wp:inline distT="0" distB="0" distL="0" distR="0">
+            <wp:extent cx="5120640" cy="3304864"/>
+            <wp:effectExtent l="0" t="0" r="0" b="0"/>
+            <wp:docPr id="9010" name="Picture 9010" descr="Wizard Step 3 for mean welfare: prices of welfare, price index source, income reference period, CPI organisation, price base year and index values."/>
+            <wp:cNvGraphicFramePr>
+              <a:graphicFrameLocks xmlns:a="http://schemas.openxmlformats.org/drawingml/2006/main" noChangeAspect="1"/>
+            </wp:cNvGraphicFramePr>
+            <a:graphic xmlns:a="http://schemas.openxmlformats.org/drawingml/2006/main">
+              <a:graphicData uri="http://schemas.openxmlformats.org/drawingml/2006/picture">
+                <pic:pic xmlns:pic="http://schemas.openxmlformats.org/drawingml/2006/picture">
+                  <pic:nvPicPr>
+                    <pic:cNvPr id="0" name="figure13b_mean_welfare_prices.png"/>
+                    <pic:cNvPicPr/>
+                  </pic:nvPicPr>
+                  <pic:blipFill>
+                    <a:blip r:embed="rIdW5kPrices"/>
+                    <a:stretch>
+                      <a:fillRect/>
+                    </a:stretch>
+                  </pic:blipFill>
+                  <pic:spPr>
+                    <a:xfrm>
+                      <a:off x="0" y="0"/>
+                      <a:ext cx="5120640" cy="3304864"/>
+                    </a:xfrm>
+                    <a:prstGeom prst="rect">
+                      <a:avLst/>
+                    </a:prstGeom>
+                  </pic:spPr>
+                </pic:pic>
+              </a:graphicData>
+            </a:graphic>
+          </wp:inline>
+        </w:drawing>
+      </w:r>
+    </w:p>
+    <w:p>
+      <w:pPr>
+        <w:pStyle w:val="ImageCaption"/>
+      </w:pPr>
+      <w:r>
+        <w:t xml:space="preserve">Figure 13b. Wizard Step 3 for mean welfare converted with a price index: prices of welfare, price index source, income reference period, CPI organisation, price base year and index values.</w:t>
+      </w:r>
+    </w:p>
+    <w:p>
+      <w:pPr>
         <w:pStyle w:val="Heading2"/>
       </w:pPr>
       <w:bookmarkStart w:id="331" w:name="_Toc238571986"/>
@@ -24111,7 +24333,7 @@
         <w:pStyle w:val="BodyText"/>
       </w:pPr>
       <w:r>
-        <w:t xml:space="preserve">Benchmarking is off by default. When enabled, select National under Benchmarking level, or select Grouped and map a region-level field. An external target file is optional; without one, the app derives targets from the survey. Also state whether PSU codes refer to consistent sampling units across the two years, since this informs the sampling-covariance assessment.</w:t>
+        <w:t xml:space="preserve">Benchmarking is off by default. When enabled, select National under Benchmarking level, or select Grouped and map a region-level field. An external target file is optional; without one, the app derives targets from the survey. For mean welfare, uploaded targets must be in the same prices as the survey welfare (Section 3.8). Also state whether PSU codes refer to consistent sampling units across the two years, since this informs the sampling-covariance assessment.</w:t>
       </w:r>
     </w:p>
     <w:p>
@@ -24273,7 +24495,7 @@
         <w:pStyle w:val="FirstParagraph"/>
       </w:pPr>
       <w:r>
-        <w:t>Review the consolidated settings summary before running. It repeats the active files, mapping, indicator, UFH and MFH choices, benchmarking, PSU assessment, bootstrap count, and AI status. Return to the relevant breadcrumb when any entry is unexpected. The Preflight tab checks the project root, report-rendering dependency, years, required input files, and spatial dependency.</w:t>
+        <w:t xml:space="preserve">Review the consolidated settings summary before running. It repeats the active files, mapping, indicator, the price basis of mean welfare (with the CPI file, when used), UFH and MFH choices, benchmarking, PSU assessment, bootstrap count, and AI status. Return to the relevant breadcrumb when any entry is unexpected. The Preflight tab checks the project root, report-rendering dependency, years, required input files, and spatial dependency.</w:t>
       </w:r>
     </w:p>
     <w:p>
@@ -24386,7 +24608,7 @@
         <w:pStyle w:val="BodyText"/>
       </w:pPr>
       <w:r>
-        <w:t>The Comparison step adds two figures for signed estimated changes: a UFH/MFH boxplot and a paired domain scatterplot. Changes are later year minus earlier year, in percentage points for poverty; negative values indicate a decrease. The figures use the same finite matched domains and unbenchmarked estimates. They are saved under outputs/figures/change_comparisons/, with values in outputs/data/change_estimate_comparison.xlsx and the consolidated EU_SAE_results.xlsx. The original confidence-interval-width figures remain available in both report formats.</w:t>
+        <w:t xml:space="preserve">The report shows box plots, side by side in one row, of the estimated change between the two years across domains and of the RMSE of that change, with one box per method: Direct, UFH, the selected MFH model and, with benchmarking, UFH benchmarked and MFH benchmarked. For poverty indicators both are in percentage points; for mean welfare the change is in ln mean welfare (the log of the later mean minus the log of the earlier mean) and its RMSE is the delta-method standard error of that log ratio. The RMSE of a direct change adds the two years' direct MSEs, UFH also treats the years as independent, and MFH uses the covariance between the years, as in the significance tests. In the HTML report a Methods drop-down list selects the boxes shown; the Word report shows all methods. The figure is saved as outputs/figures/change_comparisons/change_rmse_boxplots.png, with values in outputs/tables/change_rmse_by_method.csv and in the Change and RMSE by method and Change and RMSE summary sheets of change_estimate_comparison.xlsx and EU_SAE_results.xlsx. The paired UFH-MFH scatter plots of changes and of confidence-interval widths are retained.</w:t>
       </w:r>
     </w:p>
     <w:p>
@@ -24779,6 +25001,14 @@
     </w:p>
     <w:p>
       <w:pPr>
+        <w:pStyle w:val="BodyText"/>
+      </w:pPr>
+      <w:r>
+        <w:t xml:space="preserve">For mean welfare, the report should state the price basis: current prices; constant prices of a stated base year, with the price index, its source and the income reference period; or constant prices as provided in the survey data. The Dashboard writes this description to the run log, the report, and outputs/tables/indicator_info.csv.</w:t>
+      </w:r>
+    </w:p>
+    <w:p>
+      <w:pPr>
         <w:pStyle w:val="Heading2"/>
       </w:pPr>
       <w:bookmarkStart w:id="365" w:name="figures-and-maps-to-include"/>
@@ -24796,7 +25026,7 @@
         <w:pStyle w:val="FirstParagraph"/>
       </w:pPr>
       <w:r>
-        <w:t xml:space="preserve">The core visual outputs should include poverty maps for each year; uncertainty maps based on MSE, RMSE, and coefficients of variation; change maps with statistically significant changes clearly indicated; direct-versus-UFH scatter plots; UFH-versus-MFH scatter plots; residual plots and Q–Q plots for diagnostic assessment; and trend plots for selected areas. Together, these visuals help users assess the geographic pattern of poverty, the precision of the estimates, the extent of change over time, and model performance.</w:t>
+        <w:t xml:space="preserve">The core visual outputs should include poverty maps for each year; uncertainty maps based on MSE, RMSE, and coefficients of variation; change maps with statistically significant changes clearly indicated; box plots of the changes and their RMSEs by method; direct-versus-UFH scatter plots; UFH-versus-MFH scatter plots; residual plots and Q–Q plots for diagnostic assessment; and trend plots for selected areas. Together, these visuals help users assess the geographic pattern of poverty, the precision of the estimates, the extent of change over time, and model performance.</w:t>
       </w:r>
     </w:p>
     <w:p>
@@ -26198,6 +26428,14 @@
     </w:p>
     <w:p>
       <w:pPr>
+        <w:pStyle w:val="BodyText"/>
+      </w:pPr>
+      <w:r>
+        <w:t xml:space="preserve">For mean welfare, real changes depend on the price index. The Dashboard applies one national index to all domains, so it does not adjust for regional differences in price levels, regional inflation, or consumption baskets, and its two income-period choices assume calendar-year reference periods (Section 4.3). Deflating household welfare before estimation is the recommended order. For UFH and log-scale models, deflating before or after estimation gives the same estimates apart from numerical tolerances; for MFH2 fitted on the currency scale, which uses one random-effect variance for both years, it does not (on the Spain example, the estimates differ by at most 0.28% with 1.4% inflation and by 1.9% with 10% inflation).</w:t>
+      </w:r>
+    </w:p>
+    <w:p>
+      <w:pPr>
         <w:pStyle w:val="Heading2"/>
       </w:pPr>
       <w:bookmarkStart w:id="398" w:name="potential-extensions"/>
@@ -29378,7 +29616,7 @@
         <w:ind w:left="480"/>
       </w:pPr>
       <w:r>
-        <w:t>☐ Geometry file ready, with an area code that matches the other files exactly.</w:t>
+        <w:t xml:space="preserve">☐ Benchmark target file (optional) for the same welfare concept, prices, population, and benchmark areas as the analysis.</w:t>
       </w:r>
     </w:p>
     <w:p>
@@ -29387,7 +29625,7 @@
         <w:ind w:left="480"/>
       </w:pPr>
       <w:r>
-        <w:t>☐ Area codes confirmed identical (type and value) across all four files.</w:t>
+        <w:t>☐ Geometry file ready, with an area code that matches the other files exactly.</w:t>
       </w:r>
     </w:p>
     <w:p>
@@ -29396,7 +29634,7 @@
         <w:ind w:left="480"/>
       </w:pPr>
       <w:r>
-        <w:t>☐ Analysis years selected.</w:t>
+        <w:t>☐ Area codes confirmed identical (type and value) across all four files.</w:t>
       </w:r>
     </w:p>
     <w:p>
@@ -29405,7 +29643,25 @@
         <w:ind w:left="480"/>
       </w:pPr>
       <w:r>
+        <w:t>☐ Analysis years selected.</w:t>
+      </w:r>
+    </w:p>
+    <w:p>
+      <w:pPr>
+        <w:pStyle w:val="Compact"/>
+        <w:ind w:left="480"/>
+      </w:pPr>
+      <w:r>
         <w:t>☐ Indicator chosen (poverty FGT or mean welfare); FGT order selected if applicable.</w:t>
+      </w:r>
+    </w:p>
+    <w:p>
+      <w:pPr>
+        <w:pStyle w:val="Compact"/>
+        <w:ind w:left="480"/>
+      </w:pPr>
+      <w:r>
+        <w:t xml:space="preserve">☐ For mean welfare: prices of the welfare variable confirmed (convert current prices, keep current prices, or constant prices already); when converting, the price index, its organisation, the income reference period (survey year or calendar year before the survey), and the price base year checked, and the CPI file prepared if used.</w:t>
       </w:r>
     </w:p>
     <w:p>
@@ -37989,6 +38245,14 @@
     </w:p>
     <w:p>
       <w:pPr>
+        <w:pStyle w:val="BodyText"/>
+      </w:pPr>
+      <w:r>
+        <w:t xml:space="preserve">For mean welfare fitted in logs, the ratio benchmark is applied on the currency scale after the back-transformation: the model estimates in the formula are the back-transformed estimates, and the trusted total is the uploaded target or, without one, the population-weighted mean of the direct arithmetic means. The log-scale bootstrap, which benchmarks to the survey's own log-scale regional figures, supplies the relative precision kept in the reported MSE (Section 7.12).</w:t>
+      </w:r>
+    </w:p>
+    <w:p>
+      <w:pPr>
         <w:pStyle w:val="Heading2"/>
       </w:pPr>
       <w:bookmarkStart w:id="444" w:name="g.7-inference-for-change-over-time"/>
@@ -38916,6 +39180,1173 @@
       </w:pPr>
       <w:r>
         <w:t xml:space="preserve">The MCPE is not returned by the standard sae/msae functions and is estimated here by parametric bootstrap (pbmcpeMFH1/2/3). Prof. Isabel Molina provided the basic bootstrap code, which Ifeanyi Nzegwu Edochie refined, and the package maintainer further modified for model dispatch, use of the selected fitted model, reproducible seeds, convergence handling, Monte Carlo standard-error diagnostics, and package reporting. Note on MSE Estimation - Levels and Changes.docx documents the full uncertainty workflow: analytical or bootstrap MSE for unbenchmarked UFH by transformation, parametric-bootstrap MSE and MCPE for MFH, re-benchmarking within each bootstrap replicate, and MSE(change) = MSE(year 1) + MSE(year 2) - 2 MCPE. For change tests across areas, the Dashboard reports both raw p-values and Benjamini-Hochberg-adjusted p-values. The principal significance flag uses the pointwise raw test, p_value &lt; alpha. At alpha = 0.05, this is equivalent to the pointwise 95% confidence interval excluding zero. The p_value_bh and significant_bh fields are retained as supplementary outputs for assessing conclusions after false-discovery-rate control; they do not determine the primary figures or headline counts. This current rule supersedes the older BH-primary sentence in the companion MSE note. This area-level BH adjustment is separate from the MFH variance-test adjustment described in Section 8.6. Annex H states the validation work still required for the bootstrap implementation.</w:t>
+      </w:r>
+    </w:p>
+    <w:p>
+      <w:pPr>
+        <w:pStyle w:val="BodyText"/>
+      </w:pPr>
+      <w:r>
+        <w:t xml:space="preserve">For mean welfare, the change is reported as a percentage of the earlier year's mean,</w:t>
+      </w:r>
+    </w:p>
+    <w:p>
+      <w:pPr>
+        <w:pStyle w:val="BodyText"/>
+        <w:jc w:val="center"/>
+      </w:pPr>
+      <m:oMathPara>
+        <m:oMathParaPr>
+          <m:jc m:val="center"/>
+        </m:oMathParaPr>
+        <m:oMath>
+          <m:sSubSup>
+            <m:sSubSupPr>
+              <m:ctrlPr>
+                <w:rPr>
+                  <w:rFonts w:ascii="Cambria Math" w:hAnsi="Cambria Math"/>
+                </w:rPr>
+              </m:ctrlPr>
+            </m:sSubSupPr>
+            <m:e>
+              <m:acc>
+                <m:accPr>
+                  <m:chr m:val="^"/>
+                  <m:ctrlPr>
+                    <w:rPr>
+                      <w:rFonts w:ascii="Cambria Math" w:hAnsi="Cambria Math"/>
+                    </w:rPr>
+                  </m:ctrlPr>
+                </m:accPr>
+                <m:e>
+                  <m:r>
+                    <w:rPr>
+                      <w:rFonts w:ascii="Cambria Math" w:hAnsi="Cambria Math"/>
+                    </w:rPr>
+                    <m:t>Δ</m:t>
+                  </m:r>
+                </m:e>
+              </m:acc>
+            </m:e>
+            <m:sub>
+              <m:r>
+                <w:rPr>
+                  <w:rFonts w:ascii="Cambria Math" w:hAnsi="Cambria Math"/>
+                </w:rPr>
+                <m:t>d</m:t>
+              </m:r>
+            </m:sub>
+            <m:sup>
+              <m:r>
+                <w:rPr>
+                  <w:rFonts w:ascii="Cambria Math" w:hAnsi="Cambria Math"/>
+                </w:rPr>
+                <m:t>%</m:t>
+              </m:r>
+            </m:sup>
+          </m:sSubSup>
+          <m:r>
+            <m:rPr>
+              <m:lit/>
+              <m:nor/>
+            </m:rPr>
+            <w:rPr>
+              <w:rFonts w:ascii="Cambria Math" w:hAnsi="Cambria Math"/>
+            </w:rPr>
+            <m:t>=</m:t>
+          </m:r>
+          <m:r>
+            <w:rPr>
+              <w:rFonts w:ascii="Cambria Math" w:hAnsi="Cambria Math"/>
+            </w:rPr>
+            <m:t>100</m:t>
+          </m:r>
+          <m:r>
+            <w:rPr>
+              <w:rFonts w:ascii="Cambria Math" w:hAnsi="Cambria Math"/>
+            </w:rPr>
+            <m:t>·</m:t>
+          </m:r>
+          <m:d>
+            <m:dPr>
+              <m:ctrlPr>
+                <w:rPr>
+                  <w:rFonts w:ascii="Cambria Math" w:hAnsi="Cambria Math"/>
+                </w:rPr>
+              </m:ctrlPr>
+            </m:dPr>
+            <m:e>
+              <m:f>
+                <m:fPr>
+                  <m:ctrlPr>
+                    <w:rPr>
+                      <w:rFonts w:ascii="Cambria Math" w:hAnsi="Cambria Math"/>
+                    </w:rPr>
+                  </m:ctrlPr>
+                </m:fPr>
+                <m:num>
+                  <m:sSub>
+                    <m:sSubPr>
+                      <m:ctrlPr>
+                        <w:rPr>
+                          <w:rFonts w:ascii="Cambria Math" w:hAnsi="Cambria Math"/>
+                        </w:rPr>
+                      </m:ctrlPr>
+                    </m:sSubPr>
+                    <m:e>
+                      <m:acc>
+                        <m:accPr>
+                          <m:chr m:val="^"/>
+                          <m:ctrlPr>
+                            <w:rPr>
+                              <w:rFonts w:ascii="Cambria Math" w:hAnsi="Cambria Math"/>
+                            </w:rPr>
+                          </m:ctrlPr>
+                        </m:accPr>
+                        <m:e>
+                          <m:r>
+                            <w:rPr>
+                              <w:rFonts w:ascii="Cambria Math" w:hAnsi="Cambria Math"/>
+                            </w:rPr>
+                            <m:t>δ</m:t>
+                          </m:r>
+                        </m:e>
+                      </m:acc>
+                    </m:e>
+                    <m:sub>
+                      <m:r>
+                        <w:rPr>
+                          <w:rFonts w:ascii="Cambria Math" w:hAnsi="Cambria Math"/>
+                        </w:rPr>
+                        <m:t>dt</m:t>
+                      </m:r>
+                    </m:sub>
+                  </m:sSub>
+                </m:num>
+                <m:den>
+                  <m:sSub>
+                    <m:sSubPr>
+                      <m:ctrlPr>
+                        <w:rPr>
+                          <w:rFonts w:ascii="Cambria Math" w:hAnsi="Cambria Math"/>
+                        </w:rPr>
+                      </m:ctrlPr>
+                    </m:sSubPr>
+                    <m:e>
+                      <m:acc>
+                        <m:accPr>
+                          <m:chr m:val="^"/>
+                          <m:ctrlPr>
+                            <w:rPr>
+                              <w:rFonts w:ascii="Cambria Math" w:hAnsi="Cambria Math"/>
+                            </w:rPr>
+                          </m:ctrlPr>
+                        </m:accPr>
+                        <m:e>
+                          <m:r>
+                            <w:rPr>
+                              <w:rFonts w:ascii="Cambria Math" w:hAnsi="Cambria Math"/>
+                            </w:rPr>
+                            <m:t>δ</m:t>
+                          </m:r>
+                        </m:e>
+                      </m:acc>
+                    </m:e>
+                    <m:sub>
+                      <m:r>
+                        <w:rPr>
+                          <w:rFonts w:ascii="Cambria Math" w:hAnsi="Cambria Math"/>
+                        </w:rPr>
+                        <m:t>ds</m:t>
+                      </m:r>
+                    </m:sub>
+                  </m:sSub>
+                </m:den>
+              </m:f>
+              <m:r>
+                <w:rPr>
+                  <w:rFonts w:ascii="Cambria Math" w:hAnsi="Cambria Math"/>
+                </w:rPr>
+                <m:t>-</m:t>
+              </m:r>
+              <m:r>
+                <w:rPr>
+                  <w:rFonts w:ascii="Cambria Math" w:hAnsi="Cambria Math"/>
+                </w:rPr>
+                <m:t>1</m:t>
+              </m:r>
+            </m:e>
+          </m:d>
+        </m:oMath>
+      </m:oMathPara>
+    </w:p>
+    <w:p>
+      <w:pPr>
+        <w:pStyle w:val="BodyText"/>
+      </w:pPr>
+      <w:r>
+        <w:t xml:space="preserve">Inference uses the log of the ratio of the two means, with variance approximated by the delta method,</w:t>
+      </w:r>
+    </w:p>
+    <w:p>
+      <w:pPr>
+        <w:pStyle w:val="BodyText"/>
+        <w:jc w:val="center"/>
+      </w:pPr>
+      <m:oMathPara>
+        <m:oMathParaPr>
+          <m:jc m:val="center"/>
+        </m:oMathParaPr>
+        <m:oMath>
+          <m:sSub>
+            <m:sSubPr>
+              <m:ctrlPr>
+                <w:rPr>
+                  <w:rFonts w:ascii="Cambria Math" w:hAnsi="Cambria Math"/>
+                </w:rPr>
+              </m:ctrlPr>
+            </m:sSubPr>
+            <m:e>
+              <m:acc>
+                <m:accPr>
+                  <m:chr m:val="^"/>
+                  <m:ctrlPr>
+                    <w:rPr>
+                      <w:rFonts w:ascii="Cambria Math" w:hAnsi="Cambria Math"/>
+                    </w:rPr>
+                  </m:ctrlPr>
+                </m:accPr>
+                <m:e>
+                  <m:r>
+                    <w:rPr>
+                      <w:rFonts w:ascii="Cambria Math" w:hAnsi="Cambria Math"/>
+                    </w:rPr>
+                    <m:t>r</m:t>
+                  </m:r>
+                </m:e>
+              </m:acc>
+            </m:e>
+            <m:sub>
+              <m:r>
+                <w:rPr>
+                  <w:rFonts w:ascii="Cambria Math" w:hAnsi="Cambria Math"/>
+                </w:rPr>
+                <m:t>d</m:t>
+              </m:r>
+            </m:sub>
+          </m:sSub>
+          <m:r>
+            <m:rPr>
+              <m:lit/>
+              <m:nor/>
+            </m:rPr>
+            <w:rPr>
+              <w:rFonts w:ascii="Cambria Math" w:hAnsi="Cambria Math"/>
+            </w:rPr>
+            <m:t>=</m:t>
+          </m:r>
+          <m:r>
+            <m:rPr>
+              <m:lit/>
+              <m:nor/>
+            </m:rPr>
+            <w:rPr>
+              <w:rFonts w:ascii="Cambria Math" w:hAnsi="Cambria Math"/>
+            </w:rPr>
+            <m:t>log</m:t>
+          </m:r>
+          <m:d>
+            <m:dPr>
+              <m:ctrlPr>
+                <w:rPr>
+                  <w:rFonts w:ascii="Cambria Math" w:hAnsi="Cambria Math"/>
+                </w:rPr>
+              </m:ctrlPr>
+            </m:dPr>
+            <m:e>
+              <m:f>
+                <m:fPr>
+                  <m:ctrlPr>
+                    <w:rPr>
+                      <w:rFonts w:ascii="Cambria Math" w:hAnsi="Cambria Math"/>
+                    </w:rPr>
+                  </m:ctrlPr>
+                </m:fPr>
+                <m:num>
+                  <m:sSub>
+                    <m:sSubPr>
+                      <m:ctrlPr>
+                        <w:rPr>
+                          <w:rFonts w:ascii="Cambria Math" w:hAnsi="Cambria Math"/>
+                        </w:rPr>
+                      </m:ctrlPr>
+                    </m:sSubPr>
+                    <m:e>
+                      <m:acc>
+                        <m:accPr>
+                          <m:chr m:val="^"/>
+                          <m:ctrlPr>
+                            <w:rPr>
+                              <w:rFonts w:ascii="Cambria Math" w:hAnsi="Cambria Math"/>
+                            </w:rPr>
+                          </m:ctrlPr>
+                        </m:accPr>
+                        <m:e>
+                          <m:r>
+                            <w:rPr>
+                              <w:rFonts w:ascii="Cambria Math" w:hAnsi="Cambria Math"/>
+                            </w:rPr>
+                            <m:t>δ</m:t>
+                          </m:r>
+                        </m:e>
+                      </m:acc>
+                    </m:e>
+                    <m:sub>
+                      <m:r>
+                        <w:rPr>
+                          <w:rFonts w:ascii="Cambria Math" w:hAnsi="Cambria Math"/>
+                        </w:rPr>
+                        <m:t>dt</m:t>
+                      </m:r>
+                    </m:sub>
+                  </m:sSub>
+                </m:num>
+                <m:den>
+                  <m:sSub>
+                    <m:sSubPr>
+                      <m:ctrlPr>
+                        <w:rPr>
+                          <w:rFonts w:ascii="Cambria Math" w:hAnsi="Cambria Math"/>
+                        </w:rPr>
+                      </m:ctrlPr>
+                    </m:sSubPr>
+                    <m:e>
+                      <m:acc>
+                        <m:accPr>
+                          <m:chr m:val="^"/>
+                          <m:ctrlPr>
+                            <w:rPr>
+                              <w:rFonts w:ascii="Cambria Math" w:hAnsi="Cambria Math"/>
+                            </w:rPr>
+                          </m:ctrlPr>
+                        </m:accPr>
+                        <m:e>
+                          <m:r>
+                            <w:rPr>
+                              <w:rFonts w:ascii="Cambria Math" w:hAnsi="Cambria Math"/>
+                            </w:rPr>
+                            <m:t>δ</m:t>
+                          </m:r>
+                        </m:e>
+                      </m:acc>
+                    </m:e>
+                    <m:sub>
+                      <m:r>
+                        <w:rPr>
+                          <w:rFonts w:ascii="Cambria Math" w:hAnsi="Cambria Math"/>
+                        </w:rPr>
+                        <m:t>ds</m:t>
+                      </m:r>
+                    </m:sub>
+                  </m:sSub>
+                </m:den>
+              </m:f>
+            </m:e>
+          </m:d>
+          <m:r>
+            <w:rPr>
+              <w:rFonts w:ascii="Cambria Math" w:hAnsi="Cambria Math"/>
+            </w:rPr>
+            <m:t>,  </m:t>
+          </m:r>
+          <m:sSub>
+            <m:sSubPr>
+              <m:ctrlPr>
+                <w:rPr>
+                  <w:rFonts w:ascii="Cambria Math" w:hAnsi="Cambria Math"/>
+                </w:rPr>
+              </m:ctrlPr>
+            </m:sSubPr>
+            <m:e>
+              <m:acc>
+                <m:accPr>
+                  <m:chr m:val="^"/>
+                  <m:ctrlPr>
+                    <w:rPr>
+                      <w:rFonts w:ascii="Cambria Math" w:hAnsi="Cambria Math"/>
+                    </w:rPr>
+                  </m:ctrlPr>
+                </m:accPr>
+                <m:e>
+                  <m:r>
+                    <w:rPr>
+                      <w:rFonts w:ascii="Cambria Math" w:hAnsi="Cambria Math"/>
+                    </w:rPr>
+                    <m:t>v</m:t>
+                  </m:r>
+                </m:e>
+              </m:acc>
+            </m:e>
+            <m:sub>
+              <m:r>
+                <w:rPr>
+                  <w:rFonts w:ascii="Cambria Math" w:hAnsi="Cambria Math"/>
+                </w:rPr>
+                <m:t>d</m:t>
+              </m:r>
+            </m:sub>
+          </m:sSub>
+          <m:r>
+            <m:rPr>
+              <m:lit/>
+              <m:nor/>
+            </m:rPr>
+            <w:rPr>
+              <w:rFonts w:ascii="Cambria Math" w:hAnsi="Cambria Math"/>
+            </w:rPr>
+            <m:t>=</m:t>
+          </m:r>
+          <m:f>
+            <m:fPr>
+              <m:ctrlPr>
+                <w:rPr>
+                  <w:rFonts w:ascii="Cambria Math" w:hAnsi="Cambria Math"/>
+                </w:rPr>
+              </m:ctrlPr>
+            </m:fPr>
+            <m:num>
+              <m:r>
+                <m:rPr>
+                  <m:lit/>
+                  <m:nor/>
+                </m:rPr>
+                <w:rPr>
+                  <w:rFonts w:ascii="Cambria Math" w:hAnsi="Cambria Math"/>
+                </w:rPr>
+                <m:t>MSE</m:t>
+              </m:r>
+              <m:d>
+                <m:dPr>
+                  <m:ctrlPr>
+                    <w:rPr>
+                      <w:rFonts w:ascii="Cambria Math" w:hAnsi="Cambria Math"/>
+                    </w:rPr>
+                  </m:ctrlPr>
+                </m:dPr>
+                <m:e>
+                  <m:sSub>
+                    <m:sSubPr>
+                      <m:ctrlPr>
+                        <w:rPr>
+                          <w:rFonts w:ascii="Cambria Math" w:hAnsi="Cambria Math"/>
+                        </w:rPr>
+                      </m:ctrlPr>
+                    </m:sSubPr>
+                    <m:e>
+                      <m:acc>
+                        <m:accPr>
+                          <m:chr m:val="^"/>
+                          <m:ctrlPr>
+                            <w:rPr>
+                              <w:rFonts w:ascii="Cambria Math" w:hAnsi="Cambria Math"/>
+                            </w:rPr>
+                          </m:ctrlPr>
+                        </m:accPr>
+                        <m:e>
+                          <m:r>
+                            <w:rPr>
+                              <w:rFonts w:ascii="Cambria Math" w:hAnsi="Cambria Math"/>
+                            </w:rPr>
+                            <m:t>δ</m:t>
+                          </m:r>
+                        </m:e>
+                      </m:acc>
+                    </m:e>
+                    <m:sub>
+                      <m:r>
+                        <w:rPr>
+                          <w:rFonts w:ascii="Cambria Math" w:hAnsi="Cambria Math"/>
+                        </w:rPr>
+                        <m:t>dt</m:t>
+                      </m:r>
+                    </m:sub>
+                  </m:sSub>
+                </m:e>
+              </m:d>
+            </m:num>
+            <m:den>
+              <m:sSubSup>
+                <m:sSubSupPr>
+                  <m:ctrlPr>
+                    <w:rPr>
+                      <w:rFonts w:ascii="Cambria Math" w:hAnsi="Cambria Math"/>
+                    </w:rPr>
+                  </m:ctrlPr>
+                </m:sSubSupPr>
+                <m:e>
+                  <m:acc>
+                    <m:accPr>
+                      <m:chr m:val="^"/>
+                      <m:ctrlPr>
+                        <w:rPr>
+                          <w:rFonts w:ascii="Cambria Math" w:hAnsi="Cambria Math"/>
+                        </w:rPr>
+                      </m:ctrlPr>
+                    </m:accPr>
+                    <m:e>
+                      <m:r>
+                        <w:rPr>
+                          <w:rFonts w:ascii="Cambria Math" w:hAnsi="Cambria Math"/>
+                        </w:rPr>
+                        <m:t>δ</m:t>
+                      </m:r>
+                    </m:e>
+                  </m:acc>
+                </m:e>
+                <m:sub>
+                  <m:r>
+                    <w:rPr>
+                      <w:rFonts w:ascii="Cambria Math" w:hAnsi="Cambria Math"/>
+                    </w:rPr>
+                    <m:t>dt</m:t>
+                  </m:r>
+                </m:sub>
+                <m:sup>
+                  <m:r>
+                    <w:rPr>
+                      <w:rFonts w:ascii="Cambria Math" w:hAnsi="Cambria Math"/>
+                    </w:rPr>
+                    <m:t>2</m:t>
+                  </m:r>
+                </m:sup>
+              </m:sSubSup>
+            </m:den>
+          </m:f>
+          <m:r>
+            <w:rPr>
+              <w:rFonts w:ascii="Cambria Math" w:hAnsi="Cambria Math"/>
+            </w:rPr>
+            <m:t>+</m:t>
+          </m:r>
+          <m:f>
+            <m:fPr>
+              <m:ctrlPr>
+                <w:rPr>
+                  <w:rFonts w:ascii="Cambria Math" w:hAnsi="Cambria Math"/>
+                </w:rPr>
+              </m:ctrlPr>
+            </m:fPr>
+            <m:num>
+              <m:r>
+                <m:rPr>
+                  <m:lit/>
+                  <m:nor/>
+                </m:rPr>
+                <w:rPr>
+                  <w:rFonts w:ascii="Cambria Math" w:hAnsi="Cambria Math"/>
+                </w:rPr>
+                <m:t>MSE</m:t>
+              </m:r>
+              <m:d>
+                <m:dPr>
+                  <m:ctrlPr>
+                    <w:rPr>
+                      <w:rFonts w:ascii="Cambria Math" w:hAnsi="Cambria Math"/>
+                    </w:rPr>
+                  </m:ctrlPr>
+                </m:dPr>
+                <m:e>
+                  <m:sSub>
+                    <m:sSubPr>
+                      <m:ctrlPr>
+                        <w:rPr>
+                          <w:rFonts w:ascii="Cambria Math" w:hAnsi="Cambria Math"/>
+                        </w:rPr>
+                      </m:ctrlPr>
+                    </m:sSubPr>
+                    <m:e>
+                      <m:acc>
+                        <m:accPr>
+                          <m:chr m:val="^"/>
+                          <m:ctrlPr>
+                            <w:rPr>
+                              <w:rFonts w:ascii="Cambria Math" w:hAnsi="Cambria Math"/>
+                            </w:rPr>
+                          </m:ctrlPr>
+                        </m:accPr>
+                        <m:e>
+                          <m:r>
+                            <w:rPr>
+                              <w:rFonts w:ascii="Cambria Math" w:hAnsi="Cambria Math"/>
+                            </w:rPr>
+                            <m:t>δ</m:t>
+                          </m:r>
+                        </m:e>
+                      </m:acc>
+                    </m:e>
+                    <m:sub>
+                      <m:r>
+                        <w:rPr>
+                          <w:rFonts w:ascii="Cambria Math" w:hAnsi="Cambria Math"/>
+                        </w:rPr>
+                        <m:t>ds</m:t>
+                      </m:r>
+                    </m:sub>
+                  </m:sSub>
+                </m:e>
+              </m:d>
+            </m:num>
+            <m:den>
+              <m:sSubSup>
+                <m:sSubSupPr>
+                  <m:ctrlPr>
+                    <w:rPr>
+                      <w:rFonts w:ascii="Cambria Math" w:hAnsi="Cambria Math"/>
+                    </w:rPr>
+                  </m:ctrlPr>
+                </m:sSubSupPr>
+                <m:e>
+                  <m:acc>
+                    <m:accPr>
+                      <m:chr m:val="^"/>
+                      <m:ctrlPr>
+                        <w:rPr>
+                          <w:rFonts w:ascii="Cambria Math" w:hAnsi="Cambria Math"/>
+                        </w:rPr>
+                      </m:ctrlPr>
+                    </m:accPr>
+                    <m:e>
+                      <m:r>
+                        <w:rPr>
+                          <w:rFonts w:ascii="Cambria Math" w:hAnsi="Cambria Math"/>
+                        </w:rPr>
+                        <m:t>δ</m:t>
+                      </m:r>
+                    </m:e>
+                  </m:acc>
+                </m:e>
+                <m:sub>
+                  <m:r>
+                    <w:rPr>
+                      <w:rFonts w:ascii="Cambria Math" w:hAnsi="Cambria Math"/>
+                    </w:rPr>
+                    <m:t>ds</m:t>
+                  </m:r>
+                </m:sub>
+                <m:sup>
+                  <m:r>
+                    <w:rPr>
+                      <w:rFonts w:ascii="Cambria Math" w:hAnsi="Cambria Math"/>
+                    </w:rPr>
+                    <m:t>2</m:t>
+                  </m:r>
+                </m:sup>
+              </m:sSubSup>
+            </m:den>
+          </m:f>
+          <m:r>
+            <w:rPr>
+              <w:rFonts w:ascii="Cambria Math" w:hAnsi="Cambria Math"/>
+            </w:rPr>
+            <m:t>-</m:t>
+          </m:r>
+          <m:f>
+            <m:fPr>
+              <m:ctrlPr>
+                <w:rPr>
+                  <w:rFonts w:ascii="Cambria Math" w:hAnsi="Cambria Math"/>
+                </w:rPr>
+              </m:ctrlPr>
+            </m:fPr>
+            <m:num>
+              <m:r>
+                <w:rPr>
+                  <w:rFonts w:ascii="Cambria Math" w:hAnsi="Cambria Math"/>
+                </w:rPr>
+                <m:t>2</m:t>
+              </m:r>
+              <m:r>
+                <m:rPr>
+                  <m:lit/>
+                  <m:nor/>
+                </m:rPr>
+                <w:rPr>
+                  <w:rFonts w:ascii="Cambria Math" w:hAnsi="Cambria Math"/>
+                </w:rPr>
+                <m:t>MCPE</m:t>
+              </m:r>
+              <m:d>
+                <m:dPr>
+                  <m:ctrlPr>
+                    <w:rPr>
+                      <w:rFonts w:ascii="Cambria Math" w:hAnsi="Cambria Math"/>
+                    </w:rPr>
+                  </m:ctrlPr>
+                </m:dPr>
+                <m:e>
+                  <m:sSub>
+                    <m:sSubPr>
+                      <m:ctrlPr>
+                        <w:rPr>
+                          <w:rFonts w:ascii="Cambria Math" w:hAnsi="Cambria Math"/>
+                        </w:rPr>
+                      </m:ctrlPr>
+                    </m:sSubPr>
+                    <m:e>
+                      <m:acc>
+                        <m:accPr>
+                          <m:chr m:val="^"/>
+                          <m:ctrlPr>
+                            <w:rPr>
+                              <w:rFonts w:ascii="Cambria Math" w:hAnsi="Cambria Math"/>
+                            </w:rPr>
+                          </m:ctrlPr>
+                        </m:accPr>
+                        <m:e>
+                          <m:r>
+                            <w:rPr>
+                              <w:rFonts w:ascii="Cambria Math" w:hAnsi="Cambria Math"/>
+                            </w:rPr>
+                            <m:t>δ</m:t>
+                          </m:r>
+                        </m:e>
+                      </m:acc>
+                    </m:e>
+                    <m:sub>
+                      <m:r>
+                        <w:rPr>
+                          <w:rFonts w:ascii="Cambria Math" w:hAnsi="Cambria Math"/>
+                        </w:rPr>
+                        <m:t>dt</m:t>
+                      </m:r>
+                    </m:sub>
+                  </m:sSub>
+                  <m:r>
+                    <w:rPr>
+                      <w:rFonts w:ascii="Cambria Math" w:hAnsi="Cambria Math"/>
+                    </w:rPr>
+                    <m:t>,</m:t>
+                  </m:r>
+                  <m:sSub>
+                    <m:sSubPr>
+                      <m:ctrlPr>
+                        <w:rPr>
+                          <w:rFonts w:ascii="Cambria Math" w:hAnsi="Cambria Math"/>
+                        </w:rPr>
+                      </m:ctrlPr>
+                    </m:sSubPr>
+                    <m:e>
+                      <m:acc>
+                        <m:accPr>
+                          <m:chr m:val="^"/>
+                          <m:ctrlPr>
+                            <w:rPr>
+                              <w:rFonts w:ascii="Cambria Math" w:hAnsi="Cambria Math"/>
+                            </w:rPr>
+                          </m:ctrlPr>
+                        </m:accPr>
+                        <m:e>
+                          <m:r>
+                            <w:rPr>
+                              <w:rFonts w:ascii="Cambria Math" w:hAnsi="Cambria Math"/>
+                            </w:rPr>
+                            <m:t>δ</m:t>
+                          </m:r>
+                        </m:e>
+                      </m:acc>
+                    </m:e>
+                    <m:sub>
+                      <m:r>
+                        <w:rPr>
+                          <w:rFonts w:ascii="Cambria Math" w:hAnsi="Cambria Math"/>
+                        </w:rPr>
+                        <m:t>ds</m:t>
+                      </m:r>
+                    </m:sub>
+                  </m:sSub>
+                </m:e>
+              </m:d>
+            </m:num>
+            <m:den>
+              <m:sSub>
+                <m:sSubPr>
+                  <m:ctrlPr>
+                    <w:rPr>
+                      <w:rFonts w:ascii="Cambria Math" w:hAnsi="Cambria Math"/>
+                    </w:rPr>
+                  </m:ctrlPr>
+                </m:sSubPr>
+                <m:e>
+                  <m:acc>
+                    <m:accPr>
+                      <m:chr m:val="^"/>
+                      <m:ctrlPr>
+                        <w:rPr>
+                          <w:rFonts w:ascii="Cambria Math" w:hAnsi="Cambria Math"/>
+                        </w:rPr>
+                      </m:ctrlPr>
+                    </m:accPr>
+                    <m:e>
+                      <m:r>
+                        <w:rPr>
+                          <w:rFonts w:ascii="Cambria Math" w:hAnsi="Cambria Math"/>
+                        </w:rPr>
+                        <m:t>δ</m:t>
+                      </m:r>
+                    </m:e>
+                  </m:acc>
+                </m:e>
+                <m:sub>
+                  <m:r>
+                    <w:rPr>
+                      <w:rFonts w:ascii="Cambria Math" w:hAnsi="Cambria Math"/>
+                    </w:rPr>
+                    <m:t>dt</m:t>
+                  </m:r>
+                </m:sub>
+              </m:sSub>
+              <m:sSub>
+                <m:sSubPr>
+                  <m:ctrlPr>
+                    <w:rPr>
+                      <w:rFonts w:ascii="Cambria Math" w:hAnsi="Cambria Math"/>
+                    </w:rPr>
+                  </m:ctrlPr>
+                </m:sSubPr>
+                <m:e>
+                  <m:acc>
+                    <m:accPr>
+                      <m:chr m:val="^"/>
+                      <m:ctrlPr>
+                        <w:rPr>
+                          <w:rFonts w:ascii="Cambria Math" w:hAnsi="Cambria Math"/>
+                        </w:rPr>
+                      </m:ctrlPr>
+                    </m:accPr>
+                    <m:e>
+                      <m:r>
+                        <w:rPr>
+                          <w:rFonts w:ascii="Cambria Math" w:hAnsi="Cambria Math"/>
+                        </w:rPr>
+                        <m:t>δ</m:t>
+                      </m:r>
+                    </m:e>
+                  </m:acc>
+                </m:e>
+                <m:sub>
+                  <m:r>
+                    <w:rPr>
+                      <w:rFonts w:ascii="Cambria Math" w:hAnsi="Cambria Math"/>
+                    </w:rPr>
+                    <m:t>ds</m:t>
+                  </m:r>
+                </m:sub>
+              </m:sSub>
+            </m:den>
+          </m:f>
+        </m:oMath>
+      </m:oMathPara>
+    </w:p>
+    <w:p>
+      <w:pPr>
+        <w:pStyle w:val="BodyText"/>
+      </w:pPr>
+      <w:r>
+        <w:t xml:space="preserve">and the interval</w:t>
+      </w:r>
+    </w:p>
+    <w:p>
+      <w:pPr>
+        <w:pStyle w:val="BodyText"/>
+        <w:jc w:val="center"/>
+      </w:pPr>
+      <m:oMathPara>
+        <m:oMathParaPr>
+          <m:jc m:val="center"/>
+        </m:oMathParaPr>
+        <m:oMath>
+          <m:sSub>
+            <m:sSubPr>
+              <m:ctrlPr>
+                <w:rPr>
+                  <w:rFonts w:ascii="Cambria Math" w:hAnsi="Cambria Math"/>
+                </w:rPr>
+              </m:ctrlPr>
+            </m:sSubPr>
+            <m:e>
+              <m:r>
+                <m:rPr>
+                  <m:lit/>
+                  <m:nor/>
+                </m:rPr>
+                <w:rPr>
+                  <w:rFonts w:ascii="Cambria Math" w:hAnsi="Cambria Math"/>
+                </w:rPr>
+                <m:t>CI</m:t>
+              </m:r>
+            </m:e>
+            <m:sub>
+              <m:r>
+                <w:rPr>
+                  <w:rFonts w:ascii="Cambria Math" w:hAnsi="Cambria Math"/>
+                </w:rPr>
+                <m:t>α</m:t>
+              </m:r>
+            </m:sub>
+          </m:sSub>
+          <m:d>
+            <m:dPr>
+              <m:ctrlPr>
+                <w:rPr>
+                  <w:rFonts w:ascii="Cambria Math" w:hAnsi="Cambria Math"/>
+                </w:rPr>
+              </m:ctrlPr>
+            </m:dPr>
+            <m:e>
+              <m:sSubSup>
+                <m:sSubSupPr>
+                  <m:ctrlPr>
+                    <w:rPr>
+                      <w:rFonts w:ascii="Cambria Math" w:hAnsi="Cambria Math"/>
+                    </w:rPr>
+                  </m:ctrlPr>
+                </m:sSubSupPr>
+                <m:e>
+                  <m:r>
+                    <w:rPr>
+                      <w:rFonts w:ascii="Cambria Math" w:hAnsi="Cambria Math"/>
+                    </w:rPr>
+                    <m:t>Δ</m:t>
+                  </m:r>
+                </m:e>
+                <m:sub>
+                  <m:r>
+                    <w:rPr>
+                      <w:rFonts w:ascii="Cambria Math" w:hAnsi="Cambria Math"/>
+                    </w:rPr>
+                    <m:t>d</m:t>
+                  </m:r>
+                </m:sub>
+                <m:sup>
+                  <m:r>
+                    <w:rPr>
+                      <w:rFonts w:ascii="Cambria Math" w:hAnsi="Cambria Math"/>
+                    </w:rPr>
+                    <m:t>%</m:t>
+                  </m:r>
+                </m:sup>
+              </m:sSubSup>
+            </m:e>
+          </m:d>
+          <m:r>
+            <m:rPr>
+              <m:lit/>
+              <m:nor/>
+            </m:rPr>
+            <w:rPr>
+              <w:rFonts w:ascii="Cambria Math" w:hAnsi="Cambria Math"/>
+            </w:rPr>
+            <m:t>=</m:t>
+          </m:r>
+          <m:r>
+            <w:rPr>
+              <w:rFonts w:ascii="Cambria Math" w:hAnsi="Cambria Math"/>
+            </w:rPr>
+            <m:t>100</m:t>
+          </m:r>
+          <m:r>
+            <w:rPr>
+              <w:rFonts w:ascii="Cambria Math" w:hAnsi="Cambria Math"/>
+            </w:rPr>
+            <m:t>·</m:t>
+          </m:r>
+          <m:d>
+            <m:dPr>
+              <m:ctrlPr>
+                <w:rPr>
+                  <w:rFonts w:ascii="Cambria Math" w:hAnsi="Cambria Math"/>
+                </w:rPr>
+              </m:ctrlPr>
+            </m:dPr>
+            <m:e>
+              <m:r>
+                <m:rPr>
+                  <m:lit/>
+                  <m:nor/>
+                </m:rPr>
+                <w:rPr>
+                  <w:rFonts w:ascii="Cambria Math" w:hAnsi="Cambria Math"/>
+                </w:rPr>
+                <m:t>exp</m:t>
+              </m:r>
+              <m:d>
+                <m:dPr>
+                  <m:ctrlPr>
+                    <w:rPr>
+                      <w:rFonts w:ascii="Cambria Math" w:hAnsi="Cambria Math"/>
+                    </w:rPr>
+                  </m:ctrlPr>
+                </m:dPr>
+                <m:e>
+                  <m:sSub>
+                    <m:sSubPr>
+                      <m:ctrlPr>
+                        <w:rPr>
+                          <w:rFonts w:ascii="Cambria Math" w:hAnsi="Cambria Math"/>
+                        </w:rPr>
+                      </m:ctrlPr>
+                    </m:sSubPr>
+                    <m:e>
+                      <m:acc>
+                        <m:accPr>
+                          <m:chr m:val="^"/>
+                          <m:ctrlPr>
+                            <w:rPr>
+                              <w:rFonts w:ascii="Cambria Math" w:hAnsi="Cambria Math"/>
+                            </w:rPr>
+                          </m:ctrlPr>
+                        </m:accPr>
+                        <m:e>
+                          <m:r>
+                            <w:rPr>
+                              <w:rFonts w:ascii="Cambria Math" w:hAnsi="Cambria Math"/>
+                            </w:rPr>
+                            <m:t>r</m:t>
+                          </m:r>
+                        </m:e>
+                      </m:acc>
+                    </m:e>
+                    <m:sub>
+                      <m:r>
+                        <w:rPr>
+                          <w:rFonts w:ascii="Cambria Math" w:hAnsi="Cambria Math"/>
+                        </w:rPr>
+                        <m:t>d</m:t>
+                      </m:r>
+                    </m:sub>
+                  </m:sSub>
+                  <m:r>
+                    <w:rPr>
+                      <w:rFonts w:ascii="Cambria Math" w:hAnsi="Cambria Math"/>
+                    </w:rPr>
+                    <m:t>∓</m:t>
+                  </m:r>
+                  <m:sSub>
+                    <m:sSubPr>
+                      <m:ctrlPr>
+                        <w:rPr>
+                          <w:rFonts w:ascii="Cambria Math" w:hAnsi="Cambria Math"/>
+                        </w:rPr>
+                      </m:ctrlPr>
+                    </m:sSubPr>
+                    <m:e>
+                      <m:r>
+                        <w:rPr>
+                          <w:rFonts w:ascii="Cambria Math" w:hAnsi="Cambria Math"/>
+                        </w:rPr>
+                        <m:t>z</m:t>
+                      </m:r>
+                    </m:e>
+                    <m:sub>
+                      <m:r>
+                        <w:rPr>
+                          <w:rFonts w:ascii="Cambria Math" w:hAnsi="Cambria Math"/>
+                        </w:rPr>
+                        <m:t>α</m:t>
+                      </m:r>
+                      <m:r>
+                        <m:rPr>
+                          <m:lit/>
+                          <m:nor/>
+                        </m:rPr>
+                        <w:rPr>
+                          <w:rFonts w:ascii="Cambria Math" w:hAnsi="Cambria Math"/>
+                        </w:rPr>
+                        <m:t>/</m:t>
+                      </m:r>
+                      <m:r>
+                        <w:rPr>
+                          <w:rFonts w:ascii="Cambria Math" w:hAnsi="Cambria Math"/>
+                        </w:rPr>
+                        <m:t>2</m:t>
+                      </m:r>
+                    </m:sub>
+                  </m:sSub>
+                  <m:rad>
+                    <m:radPr>
+                      <m:degHide m:val="1"/>
+                      <m:ctrlPr>
+                        <w:rPr>
+                          <w:rFonts w:ascii="Cambria Math" w:hAnsi="Cambria Math"/>
+                        </w:rPr>
+                      </m:ctrlPr>
+                    </m:radPr>
+                    <m:deg/>
+                    <m:e>
+                      <m:sSub>
+                        <m:sSubPr>
+                          <m:ctrlPr>
+                            <w:rPr>
+                              <w:rFonts w:ascii="Cambria Math" w:hAnsi="Cambria Math"/>
+                            </w:rPr>
+                          </m:ctrlPr>
+                        </m:sSubPr>
+                        <m:e>
+                          <m:acc>
+                            <m:accPr>
+                              <m:chr m:val="^"/>
+                              <m:ctrlPr>
+                                <w:rPr>
+                                  <w:rFonts w:ascii="Cambria Math" w:hAnsi="Cambria Math"/>
+                                </w:rPr>
+                              </m:ctrlPr>
+                            </m:accPr>
+                            <m:e>
+                              <m:r>
+                                <w:rPr>
+                                  <w:rFonts w:ascii="Cambria Math" w:hAnsi="Cambria Math"/>
+                                </w:rPr>
+                                <m:t>v</m:t>
+                              </m:r>
+                            </m:e>
+                          </m:acc>
+                        </m:e>
+                        <m:sub>
+                          <m:r>
+                            <w:rPr>
+                              <w:rFonts w:ascii="Cambria Math" w:hAnsi="Cambria Math"/>
+                            </w:rPr>
+                            <m:t>d</m:t>
+                          </m:r>
+                        </m:sub>
+                      </m:sSub>
+                    </m:e>
+                  </m:rad>
+                </m:e>
+              </m:d>
+              <m:r>
+                <w:rPr>
+                  <w:rFonts w:ascii="Cambria Math" w:hAnsi="Cambria Math"/>
+                </w:rPr>
+                <m:t>-</m:t>
+              </m:r>
+              <m:r>
+                <w:rPr>
+                  <w:rFonts w:ascii="Cambria Math" w:hAnsi="Cambria Math"/>
+                </w:rPr>
+                <m:t>1</m:t>
+              </m:r>
+            </m:e>
+          </m:d>
+        </m:oMath>
+      </m:oMathPara>
+    </w:p>
+    <w:p>
+      <w:pPr>
+        <w:pStyle w:val="BodyText"/>
+      </w:pPr>
+      <w:r>
+        <w:t xml:space="preserve">which is asymmetric and never below −100%. The MCPE term is the covariance implied by the change MSE reported by the UFH or MFH step (zero for UFH, which treats the years as independent). The covariance-adjusted variance is used whenever it is positive; if it is zero, negative, or non-finite, the independence variance (the first two terms) is used and the row is flagged in mse_fallback_used.</w:t>
       </w:r>
     </w:p>
     <w:p>

</xml_diff>